<commit_message>
UD08: añade 3 diagramas Excalidraw y sustituye los ASCII que replican
</commit_message>
<xml_diff>
--- a/docx/08-enrutamiento-estatico/08-enrutamiento-estatico.docx
+++ b/docx/08-enrutamiento-estatico/08-enrutamiento-estatico.docx
@@ -1102,7 +1102,7 @@
     </w:p>
     <w:bookmarkEnd w:id="32"/>
     <w:bookmarkEnd w:id="33"/>
-    <w:bookmarkStart w:id="43" w:name="componentes-del-router"/>
+    <w:bookmarkStart w:id="46" w:name="componentes-del-router"/>
     <w:p>
       <w:pPr>
         <w:pStyle w:val="Heading1"/>
@@ -1779,7 +1779,7 @@
       </w:r>
     </w:p>
     <w:bookmarkEnd w:id="36"/>
-    <w:bookmarkStart w:id="37" w:name="secuencia-de-arranque-y-por-qué-importa"/>
+    <w:bookmarkStart w:id="40" w:name="secuencia-de-arranque-y-por-qué-importa"/>
     <w:p>
       <w:pPr>
         <w:pStyle w:val="Heading2"/>
@@ -2015,49 +2015,66 @@
     </w:p>
     <w:p>
       <w:pPr>
-        <w:pStyle w:val="SourceCode"/>
-      </w:pPr>
-      <w:r>
-        <w:rPr>
-          <w:rStyle w:val="VerbatimChar"/>
-        </w:rPr>
-        <w:t xml:space="preserve">Secuencia de arranque</w:t>
-      </w:r>
-      <w:r>
-        <w:br/>
-      </w:r>
-      <w:r>
-        <w:rPr>
-          <w:rStyle w:val="VerbatimChar"/>
-        </w:rPr>
-        <w:t xml:space="preserve">1. POST            → verifica hardware</w:t>
-      </w:r>
-      <w:r>
-        <w:br/>
-      </w:r>
-      <w:r>
-        <w:rPr>
-          <w:rStyle w:val="VerbatimChar"/>
-        </w:rPr>
-        <w:t xml:space="preserve">2. Boot ROM        → carga ROMMON (modo emergencia)</w:t>
-      </w:r>
-      <w:r>
-        <w:br/>
-      </w:r>
-      <w:r>
-        <w:rPr>
-          <w:rStyle w:val="VerbatimChar"/>
-        </w:rPr>
-        <w:t xml:space="preserve">3. IOS             → se carga desde Flash (o TFTP)</w:t>
-      </w:r>
-      <w:r>
-        <w:br/>
-      </w:r>
-      <w:r>
-        <w:rPr>
-          <w:rStyle w:val="VerbatimChar"/>
-        </w:rPr>
-        <w:t xml:space="preserve">4. startup-config  → se carga desde NVRAM (o setup mode)</w:t>
+        <w:pStyle w:val="CaptionedFigure"/>
+      </w:pPr>
+      <w:r>
+        <w:drawing>
+          <wp:inline>
+            <wp:extent cx="5334000" cy="5060461"/>
+            <wp:effectExtent b="0" l="0" r="0" t="0"/>
+            <wp:docPr descr="Secuencia de arranque de un router: POST, Boot ROM/ROMMON, carga del IOS y carga de la configuración" title="" id="38" name="Picture"/>
+            <a:graphic>
+              <a:graphicData uri="http://schemas.openxmlformats.org/drawingml/2006/picture">
+                <pic:pic>
+                  <pic:nvPicPr>
+                    <pic:cNvPr descr="public/diagrams/u08-secuencia-arranque.svg" id="39" name="Picture"/>
+                    <pic:cNvPicPr>
+                      <a:picLocks noChangeArrowheads="1" noChangeAspect="1"/>
+                    </pic:cNvPicPr>
+                  </pic:nvPicPr>
+                  <pic:blipFill>
+                    <a:blip>
+                      <a:extLst>
+                        <a:ext uri="{28A0092B-C50C-407E-A947-70E740481C1C}">
+                          <a14:useLocalDpi xmlns:a14="http://schemas.microsoft.com/office/drawing/2010/main" val="0"/>
+                        </a:ext>
+                        <a:ext uri="{96DAC541-7B7A-43D3-8B79-37D633B846F1}">
+                          <asvg:svgBlip xmlns:asvg="http://schemas.microsoft.com/office/drawing/2016/SVG/main" r:embed="rId37"/>
+                        </a:ext>
+                      </a:extLst>
+                    </a:blip>
+                    <a:stretch>
+                      <a:fillRect/>
+                    </a:stretch>
+                  </pic:blipFill>
+                  <pic:spPr bwMode="auto">
+                    <a:xfrm>
+                      <a:off x="0" y="0"/>
+                      <a:ext cx="5334000" cy="5060461"/>
+                    </a:xfrm>
+                    <a:prstGeom prst="rect">
+                      <a:avLst/>
+                    </a:prstGeom>
+                    <a:noFill/>
+                    <a:ln w="9525">
+                      <a:noFill/>
+                      <a:headEnd/>
+                      <a:tailEnd/>
+                    </a:ln>
+                  </pic:spPr>
+                </pic:pic>
+              </a:graphicData>
+            </a:graphic>
+          </wp:inline>
+        </w:drawing>
+      </w:r>
+    </w:p>
+    <w:p>
+      <w:pPr>
+        <w:pStyle w:val="ImageCaption"/>
+      </w:pPr>
+      <w:r>
+        <w:t xml:space="preserve">Secuencia de arranque de un router: POST, Boot ROM/ROMMON, carga del IOS y carga de la configuración</w:t>
       </w:r>
     </w:p>
     <w:p>
@@ -2067,8 +2084,8 @@
         </w:pict>
       </w:r>
     </w:p>
-    <w:bookmarkEnd w:id="37"/>
-    <w:bookmarkStart w:id="38" w:name="los-tres-shows-que-te-salvan-la-vida"/>
+    <w:bookmarkEnd w:id="40"/>
+    <w:bookmarkStart w:id="41" w:name="los-tres-shows-que-te-salvan-la-vida"/>
     <w:p>
       <w:pPr>
         <w:pStyle w:val="Heading2"/>
@@ -2408,8 +2425,8 @@
         </w:pict>
       </w:r>
     </w:p>
-    <w:bookmarkEnd w:id="38"/>
-    <w:bookmarkStart w:id="39" w:name="mini-chequeo"/>
+    <w:bookmarkEnd w:id="41"/>
+    <w:bookmarkStart w:id="42" w:name="mini-chequeo"/>
     <w:p>
       <w:pPr>
         <w:pStyle w:val="Heading2"/>
@@ -2574,8 +2591,8 @@
         </w:pict>
       </w:r>
     </w:p>
-    <w:bookmarkEnd w:id="39"/>
-    <w:bookmarkStart w:id="40" w:name="resumen-en-3-frases"/>
+    <w:bookmarkEnd w:id="42"/>
+    <w:bookmarkStart w:id="43" w:name="resumen-en-3-frases"/>
     <w:p>
       <w:pPr>
         <w:pStyle w:val="Heading2"/>
@@ -2706,8 +2723,8 @@
         <w:t xml:space="preserve">te cuentan qué hay en cada memoria.</w:t>
       </w:r>
     </w:p>
-    <w:bookmarkEnd w:id="40"/>
-    <w:bookmarkStart w:id="42" w:name="vocabulario-rápido"/>
+    <w:bookmarkEnd w:id="43"/>
+    <w:bookmarkStart w:id="45" w:name="vocabulario-rápido"/>
     <w:p>
       <w:pPr>
         <w:pStyle w:val="Heading2"/>
@@ -2943,7 +2960,7 @@
       <w:r>
         <w:t xml:space="preserve"> </w:t>
       </w:r>
-      <w:hyperlink r:id="rId41">
+      <w:hyperlink r:id="rId44">
         <w:r>
           <w:rPr>
             <w:rStyle w:val="Hyperlink"/>
@@ -2970,7 +2987,7 @@
       <w:r>
         <w:t xml:space="preserve"> </w:t>
       </w:r>
-      <w:hyperlink r:id="rId41">
+      <w:hyperlink r:id="rId44">
         <w:r>
           <w:rPr>
             <w:rStyle w:val="Hyperlink"/>
@@ -3006,9 +3023,9 @@
         </w:r>
       </w:hyperlink>
     </w:p>
-    <w:bookmarkEnd w:id="42"/>
-    <w:bookmarkEnd w:id="43"/>
-    <w:bookmarkStart w:id="52" w:name="configuración-básica"/>
+    <w:bookmarkEnd w:id="45"/>
+    <w:bookmarkEnd w:id="46"/>
+    <w:bookmarkStart w:id="55" w:name="configuración-básica"/>
     <w:p>
       <w:pPr>
         <w:pStyle w:val="Heading1"/>
@@ -3072,7 +3089,7 @@
         </w:pict>
       </w:r>
     </w:p>
-    <w:bookmarkStart w:id="44" w:name="la-idea-en-una-frase-1"/>
+    <w:bookmarkStart w:id="47" w:name="la-idea-en-una-frase-1"/>
     <w:p>
       <w:pPr>
         <w:pStyle w:val="Heading2"/>
@@ -3146,8 +3163,8 @@
         </w:pict>
       </w:r>
     </w:p>
-    <w:bookmarkEnd w:id="44"/>
-    <w:bookmarkStart w:id="45" w:name="los-modos-cli-la-escalera-de-privilegios"/>
+    <w:bookmarkEnd w:id="47"/>
+    <w:bookmarkStart w:id="48" w:name="los-modos-cli-la-escalera-de-privilegios"/>
     <w:p>
       <w:pPr>
         <w:pStyle w:val="Heading2"/>
@@ -3614,8 +3631,8 @@
         </w:pict>
       </w:r>
     </w:p>
-    <w:bookmarkEnd w:id="45"/>
-    <w:bookmarkStart w:id="46" w:name="X4448351456935ae7c5416ecbc62f88f969248b8"/>
+    <w:bookmarkEnd w:id="48"/>
+    <w:bookmarkStart w:id="49" w:name="X4448351456935ae7c5416ecbc62f88f969248b8"/>
     <w:p>
       <w:pPr>
         <w:pStyle w:val="Heading2"/>
@@ -4879,8 +4896,8 @@
         </w:pict>
       </w:r>
     </w:p>
-    <w:bookmarkEnd w:id="46"/>
-    <w:bookmarkStart w:id="47" w:name="X80ebfba019e23de89f614dd87e827f30f63eaa4"/>
+    <w:bookmarkEnd w:id="49"/>
+    <w:bookmarkStart w:id="50" w:name="X80ebfba019e23de89f614dd87e827f30f63eaa4"/>
     <w:p>
       <w:pPr>
         <w:pStyle w:val="Heading2"/>
@@ -5170,8 +5187,8 @@
         </w:pict>
       </w:r>
     </w:p>
-    <w:bookmarkEnd w:id="47"/>
-    <w:bookmarkStart w:id="48" w:name="X179179ad9493cf2e24319b0f65540b76493d516"/>
+    <w:bookmarkEnd w:id="50"/>
+    <w:bookmarkStart w:id="51" w:name="X179179ad9493cf2e24319b0f65540b76493d516"/>
     <w:p>
       <w:pPr>
         <w:pStyle w:val="Heading2"/>
@@ -5629,8 +5646,8 @@
         </w:pict>
       </w:r>
     </w:p>
-    <w:bookmarkEnd w:id="48"/>
-    <w:bookmarkStart w:id="49" w:name="mini-chequeo-1"/>
+    <w:bookmarkEnd w:id="51"/>
+    <w:bookmarkStart w:id="52" w:name="mini-chequeo-1"/>
     <w:p>
       <w:pPr>
         <w:pStyle w:val="Heading2"/>
@@ -5865,8 +5882,8 @@
         </w:pict>
       </w:r>
     </w:p>
-    <w:bookmarkEnd w:id="49"/>
-    <w:bookmarkStart w:id="50" w:name="resumen-en-3-frases-1"/>
+    <w:bookmarkEnd w:id="52"/>
+    <w:bookmarkStart w:id="53" w:name="resumen-en-3-frases-1"/>
     <w:p>
       <w:pPr>
         <w:pStyle w:val="Heading2"/>
@@ -6059,8 +6076,8 @@
         <w:t xml:space="preserve">: configurar y no comprobar es lanzar un dado.</w:t>
       </w:r>
     </w:p>
-    <w:bookmarkEnd w:id="50"/>
-    <w:bookmarkStart w:id="51" w:name="vocabulario-rápido-1"/>
+    <w:bookmarkEnd w:id="53"/>
+    <w:bookmarkStart w:id="54" w:name="vocabulario-rápido-1"/>
     <w:p>
       <w:pPr>
         <w:pStyle w:val="Heading2"/>
@@ -6311,7 +6328,7 @@
       <w:r>
         <w:t xml:space="preserve"> </w:t>
       </w:r>
-      <w:hyperlink r:id="rId41">
+      <w:hyperlink r:id="rId44">
         <w:r>
           <w:rPr>
             <w:rStyle w:val="Hyperlink"/>
@@ -6374,9 +6391,9 @@
         </w:r>
       </w:hyperlink>
     </w:p>
-    <w:bookmarkEnd w:id="51"/>
-    <w:bookmarkEnd w:id="52"/>
-    <w:bookmarkStart w:id="62" w:name="rutas-estáticas"/>
+    <w:bookmarkEnd w:id="54"/>
+    <w:bookmarkEnd w:id="55"/>
+    <w:bookmarkStart w:id="68" w:name="rutas-estáticas"/>
     <w:p>
       <w:pPr>
         <w:pStyle w:val="Heading1"/>
@@ -6440,7 +6457,7 @@
         </w:pict>
       </w:r>
     </w:p>
-    <w:bookmarkStart w:id="53" w:name="la-idea-en-una-frase-2"/>
+    <w:bookmarkStart w:id="56" w:name="la-idea-en-una-frase-2"/>
     <w:p>
       <w:pPr>
         <w:pStyle w:val="Heading2"/>
@@ -6562,8 +6579,8 @@
         </w:pict>
       </w:r>
     </w:p>
-    <w:bookmarkEnd w:id="53"/>
-    <w:bookmarkStart w:id="54" w:name="la-sintaxis-una-línea-que-abre-un-camino"/>
+    <w:bookmarkEnd w:id="56"/>
+    <w:bookmarkStart w:id="57" w:name="la-sintaxis-una-línea-que-abre-un-camino"/>
     <w:p>
       <w:pPr>
         <w:pStyle w:val="Heading2"/>
@@ -6951,8 +6968,8 @@
         </w:pict>
       </w:r>
     </w:p>
-    <w:bookmarkEnd w:id="54"/>
-    <w:bookmarkStart w:id="55" w:name="Xb5f6ec9f7d3215e5db8c38299f0e62a53610219"/>
+    <w:bookmarkEnd w:id="57"/>
+    <w:bookmarkStart w:id="61" w:name="Xb5f6ec9f7d3215e5db8c38299f0e62a53610219"/>
     <w:p>
       <w:pPr>
         <w:pStyle w:val="Heading2"/>
@@ -6971,31 +6988,66 @@
     </w:p>
     <w:p>
       <w:pPr>
-        <w:pStyle w:val="SourceCode"/>
-      </w:pPr>
-      <w:r>
-        <w:rPr>
-          <w:rStyle w:val="VerbatimChar"/>
-        </w:rPr>
-        <w:t xml:space="preserve">R1 ──── 10.0.0.0/30 ──── R2 ──── Internet</w:t>
-      </w:r>
-      <w:r>
-        <w:br/>
-      </w:r>
-      <w:r>
-        <w:rPr>
-          <w:rStyle w:val="VerbatimChar"/>
-        </w:rPr>
-        <w:t xml:space="preserve"> │                           │</w:t>
-      </w:r>
-      <w:r>
-        <w:br/>
-      </w:r>
-      <w:r>
-        <w:rPr>
-          <w:rStyle w:val="VerbatimChar"/>
-        </w:rPr>
-        <w:t xml:space="preserve">192.168.1.0/24           192.168.2.0/24</w:t>
+        <w:pStyle w:val="CaptionedFigure"/>
+      </w:pPr>
+      <w:r>
+        <w:drawing>
+          <wp:inline>
+            <wp:extent cx="5334000" cy="3119886"/>
+            <wp:effectExtent b="0" l="0" r="0" t="0"/>
+            <wp:docPr descr="Topología de la unidad: R1 con LAN 192.168.1.0/24, enlace WAN 10.0.0.0/30 y R2 con LAN 192.168.2.0/24 y salida a Internet" title="" id="59" name="Picture"/>
+            <a:graphic>
+              <a:graphicData uri="http://schemas.openxmlformats.org/drawingml/2006/picture">
+                <pic:pic>
+                  <pic:nvPicPr>
+                    <pic:cNvPr descr="public/diagrams/u08-topologia-r1-r2.svg" id="60" name="Picture"/>
+                    <pic:cNvPicPr>
+                      <a:picLocks noChangeArrowheads="1" noChangeAspect="1"/>
+                    </pic:cNvPicPr>
+                  </pic:nvPicPr>
+                  <pic:blipFill>
+                    <a:blip>
+                      <a:extLst>
+                        <a:ext uri="{28A0092B-C50C-407E-A947-70E740481C1C}">
+                          <a14:useLocalDpi xmlns:a14="http://schemas.microsoft.com/office/drawing/2010/main" val="0"/>
+                        </a:ext>
+                        <a:ext uri="{96DAC541-7B7A-43D3-8B79-37D633B846F1}">
+                          <asvg:svgBlip xmlns:asvg="http://schemas.microsoft.com/office/drawing/2016/SVG/main" r:embed="rId58"/>
+                        </a:ext>
+                      </a:extLst>
+                    </a:blip>
+                    <a:stretch>
+                      <a:fillRect/>
+                    </a:stretch>
+                  </pic:blipFill>
+                  <pic:spPr bwMode="auto">
+                    <a:xfrm>
+                      <a:off x="0" y="0"/>
+                      <a:ext cx="5334000" cy="3119886"/>
+                    </a:xfrm>
+                    <a:prstGeom prst="rect">
+                      <a:avLst/>
+                    </a:prstGeom>
+                    <a:noFill/>
+                    <a:ln w="9525">
+                      <a:noFill/>
+                      <a:headEnd/>
+                      <a:tailEnd/>
+                    </a:ln>
+                  </pic:spPr>
+                </pic:pic>
+              </a:graphicData>
+            </a:graphic>
+          </wp:inline>
+        </w:drawing>
+      </w:r>
+    </w:p>
+    <w:p>
+      <w:pPr>
+        <w:pStyle w:val="ImageCaption"/>
+      </w:pPr>
+      <w:r>
+        <w:t xml:space="preserve">Topología de la unidad: R1 con LAN 192.168.1.0/24, enlace WAN 10.0.0.0/30 y R2 con LAN 192.168.2.0/24 y salida a Internet</w:t>
       </w:r>
     </w:p>
     <w:p>
@@ -7137,8 +7189,8 @@
         </w:pict>
       </w:r>
     </w:p>
-    <w:bookmarkEnd w:id="55"/>
-    <w:bookmarkStart w:id="56" w:name="X51fde5b68fa99ab5ca6f87c85636bc22ec72bfe"/>
+    <w:bookmarkEnd w:id="61"/>
+    <w:bookmarkStart w:id="62" w:name="X51fde5b68fa99ab5ca6f87c85636bc22ec72bfe"/>
     <w:p>
       <w:pPr>
         <w:pStyle w:val="Heading2"/>
@@ -7440,8 +7492,8 @@
         </w:pict>
       </w:r>
     </w:p>
-    <w:bookmarkEnd w:id="56"/>
-    <w:bookmarkStart w:id="57" w:name="Xd871bfd823f84c787a01826b7191cecb60f88e3"/>
+    <w:bookmarkEnd w:id="62"/>
+    <w:bookmarkStart w:id="63" w:name="Xd871bfd823f84c787a01826b7191cecb60f88e3"/>
     <w:p>
       <w:pPr>
         <w:pStyle w:val="Heading2"/>
@@ -7737,8 +7789,8 @@
         </w:pict>
       </w:r>
     </w:p>
-    <w:bookmarkEnd w:id="57"/>
-    <w:bookmarkStart w:id="58" w:name="verificación-show-ip-route"/>
+    <w:bookmarkEnd w:id="63"/>
+    <w:bookmarkStart w:id="64" w:name="verificación-show-ip-route"/>
     <w:p>
       <w:pPr>
         <w:pStyle w:val="Heading2"/>
@@ -8293,8 +8345,8 @@
         </w:pict>
       </w:r>
     </w:p>
-    <w:bookmarkEnd w:id="58"/>
-    <w:bookmarkStart w:id="59" w:name="mini-chequeo-2"/>
+    <w:bookmarkEnd w:id="64"/>
+    <w:bookmarkStart w:id="65" w:name="mini-chequeo-2"/>
     <w:p>
       <w:pPr>
         <w:pStyle w:val="Heading2"/>
@@ -8581,8 +8633,8 @@
         </w:pict>
       </w:r>
     </w:p>
-    <w:bookmarkEnd w:id="59"/>
-    <w:bookmarkStart w:id="60" w:name="resumen-en-3-frases-2"/>
+    <w:bookmarkEnd w:id="65"/>
+    <w:bookmarkStart w:id="66" w:name="resumen-en-3-frases-2"/>
     <w:p>
       <w:pPr>
         <w:pStyle w:val="Heading2"/>
@@ -8719,8 +8771,8 @@
         <w:t xml:space="preserve">.</w:t>
       </w:r>
     </w:p>
-    <w:bookmarkEnd w:id="60"/>
-    <w:bookmarkStart w:id="61" w:name="vocabulario-rápido-2"/>
+    <w:bookmarkEnd w:id="66"/>
+    <w:bookmarkStart w:id="67" w:name="vocabulario-rápido-2"/>
     <w:p>
       <w:pPr>
         <w:pStyle w:val="Heading2"/>
@@ -8956,7 +9008,7 @@
       <w:r>
         <w:t xml:space="preserve"> </w:t>
       </w:r>
-      <w:hyperlink r:id="rId41">
+      <w:hyperlink r:id="rId44">
         <w:r>
           <w:rPr>
             <w:rStyle w:val="Hyperlink"/>
@@ -9019,9 +9071,9 @@
         </w:r>
       </w:hyperlink>
     </w:p>
-    <w:bookmarkEnd w:id="61"/>
-    <w:bookmarkEnd w:id="62"/>
-    <w:bookmarkStart w:id="70" w:name="ruta-por-defecto"/>
+    <w:bookmarkEnd w:id="67"/>
+    <w:bookmarkEnd w:id="68"/>
+    <w:bookmarkStart w:id="76" w:name="ruta-por-defecto"/>
     <w:p>
       <w:pPr>
         <w:pStyle w:val="Heading1"/>
@@ -9085,7 +9137,7 @@
         </w:pict>
       </w:r>
     </w:p>
-    <w:bookmarkStart w:id="63" w:name="la-idea-en-una-frase-3"/>
+    <w:bookmarkStart w:id="69" w:name="la-idea-en-una-frase-3"/>
     <w:p>
       <w:pPr>
         <w:pStyle w:val="Heading2"/>
@@ -9163,8 +9215,8 @@
         </w:pict>
       </w:r>
     </w:p>
-    <w:bookmarkEnd w:id="63"/>
-    <w:bookmarkStart w:id="64" w:name="qué-es-0.0.0.00-el-callejón-universal"/>
+    <w:bookmarkEnd w:id="69"/>
+    <w:bookmarkStart w:id="70" w:name="qué-es-0.0.0.00-el-callejón-universal"/>
     <w:p>
       <w:pPr>
         <w:pStyle w:val="Heading2"/>
@@ -9554,8 +9606,8 @@
         </w:pict>
       </w:r>
     </w:p>
-    <w:bookmarkEnd w:id="64"/>
-    <w:bookmarkStart w:id="65" w:name="X496dd05e79298e6d007ae990c5afb6e7c7d7eeb"/>
+    <w:bookmarkEnd w:id="70"/>
+    <w:bookmarkStart w:id="71" w:name="X496dd05e79298e6d007ae990c5afb6e7c7d7eeb"/>
     <w:p>
       <w:pPr>
         <w:pStyle w:val="Heading2"/>
@@ -9917,8 +9969,8 @@
         </w:pict>
       </w:r>
     </w:p>
-    <w:bookmarkEnd w:id="65"/>
-    <w:bookmarkStart w:id="66" w:name="cuándo-se-activa-el-respaldo"/>
+    <w:bookmarkEnd w:id="71"/>
+    <w:bookmarkStart w:id="72" w:name="cuándo-se-activa-el-respaldo"/>
     <w:p>
       <w:pPr>
         <w:pStyle w:val="Heading2"/>
@@ -10168,8 +10220,8 @@
         </w:pict>
       </w:r>
     </w:p>
-    <w:bookmarkEnd w:id="66"/>
-    <w:bookmarkStart w:id="67" w:name="mini-chequeo-3"/>
+    <w:bookmarkEnd w:id="72"/>
+    <w:bookmarkStart w:id="73" w:name="mini-chequeo-3"/>
     <w:p>
       <w:pPr>
         <w:pStyle w:val="Heading2"/>
@@ -10343,8 +10395,8 @@
         </w:pict>
       </w:r>
     </w:p>
-    <w:bookmarkEnd w:id="67"/>
-    <w:bookmarkStart w:id="68" w:name="resumen-en-3-frases-3"/>
+    <w:bookmarkEnd w:id="73"/>
+    <w:bookmarkStart w:id="74" w:name="resumen-en-3-frases-3"/>
     <w:p>
       <w:pPr>
         <w:pStyle w:val="Heading2"/>
@@ -10414,8 +10466,8 @@
         <w:t xml:space="preserve">(misma ruta con AD mayor) es el plan B automático: solo se activa cuando la primaria desaparece del mapa.</w:t>
       </w:r>
     </w:p>
-    <w:bookmarkEnd w:id="68"/>
-    <w:bookmarkStart w:id="69" w:name="vocabulario-rápido-3"/>
+    <w:bookmarkEnd w:id="74"/>
+    <w:bookmarkStart w:id="75" w:name="vocabulario-rápido-3"/>
     <w:p>
       <w:pPr>
         <w:pStyle w:val="Heading2"/>
@@ -10622,7 +10674,7 @@
       <w:r>
         <w:t xml:space="preserve"> </w:t>
       </w:r>
-      <w:hyperlink r:id="rId41">
+      <w:hyperlink r:id="rId44">
         <w:r>
           <w:rPr>
             <w:rStyle w:val="Hyperlink"/>
@@ -10685,9 +10737,9 @@
         </w:r>
       </w:hyperlink>
     </w:p>
-    <w:bookmarkEnd w:id="69"/>
-    <w:bookmarkEnd w:id="70"/>
-    <w:bookmarkStart w:id="78" w:name="cómo-decide-un-router"/>
+    <w:bookmarkEnd w:id="75"/>
+    <w:bookmarkEnd w:id="76"/>
+    <w:bookmarkStart w:id="87" w:name="cómo-decide-un-router"/>
     <w:p>
       <w:pPr>
         <w:pStyle w:val="Heading1"/>
@@ -10751,7 +10803,7 @@
         </w:pict>
       </w:r>
     </w:p>
-    <w:bookmarkStart w:id="71" w:name="la-idea-en-una-frase-4"/>
+    <w:bookmarkStart w:id="77" w:name="la-idea-en-una-frase-4"/>
     <w:p>
       <w:pPr>
         <w:pStyle w:val="Heading2"/>
@@ -10825,8 +10877,8 @@
         </w:pict>
       </w:r>
     </w:p>
-    <w:bookmarkEnd w:id="71"/>
-    <w:bookmarkStart w:id="72" w:name="el-viaje-de-un-paquete-paso-a-paso"/>
+    <w:bookmarkEnd w:id="77"/>
+    <w:bookmarkStart w:id="81" w:name="el-viaje-de-un-paquete-paso-a-paso"/>
     <w:p>
       <w:pPr>
         <w:pStyle w:val="Heading2"/>
@@ -10958,67 +11010,66 @@
     </w:p>
     <w:p>
       <w:pPr>
-        <w:pStyle w:val="SourceCode"/>
-      </w:pPr>
-      <w:r>
-        <w:rPr>
-          <w:rStyle w:val="VerbatimChar"/>
-        </w:rPr>
-        <w:t xml:space="preserve">Paquete llega → ¿destino local? ──sí──▶ entrégalo a la interfaz</w:t>
-      </w:r>
-      <w:r>
-        <w:br/>
-      </w:r>
-      <w:r>
-        <w:rPr>
-          <w:rStyle w:val="VerbatimChar"/>
-        </w:rPr>
-        <w:t xml:space="preserve">     │</w:t>
-      </w:r>
-      <w:r>
-        <w:br/>
-      </w:r>
-      <w:r>
-        <w:rPr>
-          <w:rStyle w:val="VerbatimChar"/>
-        </w:rPr>
-        <w:t xml:space="preserve">     └no── ¿ruta en la tabla? ──sí──▶ reenvía por el next-hop</w:t>
-      </w:r>
-      <w:r>
-        <w:br/>
-      </w:r>
-      <w:r>
-        <w:rPr>
-          <w:rStyle w:val="VerbatimChar"/>
-        </w:rPr>
-        <w:t xml:space="preserve">                 │</w:t>
-      </w:r>
-      <w:r>
-        <w:br/>
-      </w:r>
-      <w:r>
-        <w:rPr>
-          <w:rStyle w:val="VerbatimChar"/>
-        </w:rPr>
-        <w:t xml:space="preserve">                 └no── ¿ruta por defecto? ──sí──▶ sale por la default</w:t>
-      </w:r>
-      <w:r>
-        <w:br/>
-      </w:r>
-      <w:r>
-        <w:rPr>
-          <w:rStyle w:val="VerbatimChar"/>
-        </w:rPr>
-        <w:t xml:space="preserve">                             │</w:t>
-      </w:r>
-      <w:r>
-        <w:br/>
-      </w:r>
-      <w:r>
-        <w:rPr>
-          <w:rStyle w:val="VerbatimChar"/>
-        </w:rPr>
-        <w:t xml:space="preserve">                             └no── ▶ descarta + ICMP "Destination Net Unreachable"</w:t>
+        <w:pStyle w:val="CaptionedFigure"/>
+      </w:pPr>
+      <w:r>
+        <w:drawing>
+          <wp:inline>
+            <wp:extent cx="5334000" cy="5706139"/>
+            <wp:effectExtent b="0" l="0" r="0" t="0"/>
+            <wp:docPr descr="Cascada de decisiones del router: red conectada, ruta en la tabla, ruta por defecto y descarte con ICMP unreachable" title="" id="79" name="Picture"/>
+            <a:graphic>
+              <a:graphicData uri="http://schemas.openxmlformats.org/drawingml/2006/picture">
+                <pic:pic>
+                  <pic:nvPicPr>
+                    <pic:cNvPr descr="public/diagrams/u08-decision-router.svg" id="80" name="Picture"/>
+                    <pic:cNvPicPr>
+                      <a:picLocks noChangeArrowheads="1" noChangeAspect="1"/>
+                    </pic:cNvPicPr>
+                  </pic:nvPicPr>
+                  <pic:blipFill>
+                    <a:blip>
+                      <a:extLst>
+                        <a:ext uri="{28A0092B-C50C-407E-A947-70E740481C1C}">
+                          <a14:useLocalDpi xmlns:a14="http://schemas.microsoft.com/office/drawing/2010/main" val="0"/>
+                        </a:ext>
+                        <a:ext uri="{96DAC541-7B7A-43D3-8B79-37D633B846F1}">
+                          <asvg:svgBlip xmlns:asvg="http://schemas.microsoft.com/office/drawing/2016/SVG/main" r:embed="rId78"/>
+                        </a:ext>
+                      </a:extLst>
+                    </a:blip>
+                    <a:stretch>
+                      <a:fillRect/>
+                    </a:stretch>
+                  </pic:blipFill>
+                  <pic:spPr bwMode="auto">
+                    <a:xfrm>
+                      <a:off x="0" y="0"/>
+                      <a:ext cx="5334000" cy="5706139"/>
+                    </a:xfrm>
+                    <a:prstGeom prst="rect">
+                      <a:avLst/>
+                    </a:prstGeom>
+                    <a:noFill/>
+                    <a:ln w="9525">
+                      <a:noFill/>
+                      <a:headEnd/>
+                      <a:tailEnd/>
+                    </a:ln>
+                  </pic:spPr>
+                </pic:pic>
+              </a:graphicData>
+            </a:graphic>
+          </wp:inline>
+        </w:drawing>
+      </w:r>
+    </w:p>
+    <w:p>
+      <w:pPr>
+        <w:pStyle w:val="ImageCaption"/>
+      </w:pPr>
+      <w:r>
+        <w:t xml:space="preserve">Cascada de decisiones del router: red conectada, ruta en la tabla, ruta por defecto y descarte con ICMP unreachable</w:t>
       </w:r>
     </w:p>
     <w:p>
@@ -11052,8 +11103,8 @@
         </w:pict>
       </w:r>
     </w:p>
-    <w:bookmarkEnd w:id="72"/>
-    <w:bookmarkStart w:id="73" w:name="los-tipos-de-rutas-quién-las-descubre"/>
+    <w:bookmarkEnd w:id="81"/>
+    <w:bookmarkStart w:id="82" w:name="los-tipos-de-rutas-quién-las-descubre"/>
     <w:p>
       <w:pPr>
         <w:pStyle w:val="Heading2"/>
@@ -11346,8 +11397,8 @@
         </w:pict>
       </w:r>
     </w:p>
-    <w:bookmarkEnd w:id="73"/>
-    <w:bookmarkStart w:id="74" w:name="Xcd118261b077732d38d68b3aa33d20798014c77"/>
+    <w:bookmarkEnd w:id="82"/>
+    <w:bookmarkStart w:id="83" w:name="Xcd118261b077732d38d68b3aa33d20798014c77"/>
     <w:p>
       <w:pPr>
         <w:pStyle w:val="Heading2"/>
@@ -11790,8 +11841,8 @@
         </w:pict>
       </w:r>
     </w:p>
-    <w:bookmarkEnd w:id="74"/>
-    <w:bookmarkStart w:id="75" w:name="mini-chequeo-4"/>
+    <w:bookmarkEnd w:id="83"/>
+    <w:bookmarkStart w:id="84" w:name="mini-chequeo-4"/>
     <w:p>
       <w:pPr>
         <w:pStyle w:val="Heading2"/>
@@ -11951,8 +12002,8 @@
         </w:pict>
       </w:r>
     </w:p>
-    <w:bookmarkEnd w:id="75"/>
-    <w:bookmarkStart w:id="76" w:name="resumen-en-3-frases-4"/>
+    <w:bookmarkEnd w:id="84"/>
+    <w:bookmarkStart w:id="85" w:name="resumen-en-3-frases-4"/>
     <w:p>
       <w:pPr>
         <w:pStyle w:val="Heading2"/>
@@ -12042,8 +12093,8 @@
         <w:t xml:space="preserve">(longest prefix match); solo proceden la AD y la métrica si hay empate.</w:t>
       </w:r>
     </w:p>
-    <w:bookmarkEnd w:id="76"/>
-    <w:bookmarkStart w:id="77" w:name="vocabulario-rápido-4"/>
+    <w:bookmarkEnd w:id="85"/>
+    <w:bookmarkStart w:id="86" w:name="vocabulario-rápido-4"/>
     <w:p>
       <w:pPr>
         <w:pStyle w:val="Heading2"/>
@@ -12241,7 +12292,7 @@
       <w:r>
         <w:t xml:space="preserve"> </w:t>
       </w:r>
-      <w:hyperlink r:id="rId41">
+      <w:hyperlink r:id="rId44">
         <w:r>
           <w:rPr>
             <w:rStyle w:val="Hyperlink"/>
@@ -12304,9 +12355,9 @@
         </w:r>
       </w:hyperlink>
     </w:p>
-    <w:bookmarkEnd w:id="77"/>
-    <w:bookmarkEnd w:id="78"/>
-    <w:bookmarkStart w:id="91" w:name="cierre-consolida-lo-aprendido"/>
+    <w:bookmarkEnd w:id="86"/>
+    <w:bookmarkEnd w:id="87"/>
+    <w:bookmarkStart w:id="100" w:name="cierre-consolida-lo-aprendido"/>
     <w:p>
       <w:pPr>
         <w:pStyle w:val="Heading1"/>
@@ -12402,7 +12453,7 @@
         </w:pict>
       </w:r>
     </w:p>
-    <w:bookmarkStart w:id="79" w:name="sé-el-paquete"/>
+    <w:bookmarkStart w:id="88" w:name="sé-el-paquete"/>
     <w:p>
       <w:pPr>
         <w:pStyle w:val="Heading2"/>
@@ -12644,8 +12695,8 @@
         </w:pict>
       </w:r>
     </w:p>
-    <w:bookmarkEnd w:id="79"/>
-    <w:bookmarkStart w:id="80" w:name="Xfa6f01f1bcd406fe30d96d0488036d77e55f246"/>
+    <w:bookmarkEnd w:id="88"/>
+    <w:bookmarkStart w:id="89" w:name="Xfa6f01f1bcd406fe30d96d0488036d77e55f246"/>
     <w:p>
       <w:pPr>
         <w:pStyle w:val="Heading2"/>
@@ -12799,8 +12850,8 @@
         </w:pict>
       </w:r>
     </w:p>
-    <w:bookmarkEnd w:id="80"/>
-    <w:bookmarkStart w:id="81" w:name="quién-soy"/>
+    <w:bookmarkEnd w:id="89"/>
+    <w:bookmarkStart w:id="90" w:name="quién-soy"/>
     <w:p>
       <w:pPr>
         <w:pStyle w:val="Heading2"/>
@@ -12968,8 +13019,8 @@
         </w:pict>
       </w:r>
     </w:p>
-    <w:bookmarkEnd w:id="81"/>
-    <w:bookmarkStart w:id="82" w:name="Xa842808f00a830dbf7e61964541385f51f759b2"/>
+    <w:bookmarkEnd w:id="90"/>
+    <w:bookmarkStart w:id="91" w:name="Xa842808f00a830dbf7e61964541385f51f759b2"/>
     <w:p>
       <w:pPr>
         <w:pStyle w:val="Heading2"/>
@@ -13108,8 +13159,8 @@
         </w:pict>
       </w:r>
     </w:p>
-    <w:bookmarkEnd w:id="82"/>
-    <w:bookmarkStart w:id="83" w:name="X44bf548149e86da58f55ac7fdcde18001ce328f"/>
+    <w:bookmarkEnd w:id="91"/>
+    <w:bookmarkStart w:id="92" w:name="X44bf548149e86da58f55ac7fdcde18001ce328f"/>
     <w:p>
       <w:pPr>
         <w:pStyle w:val="Heading2"/>
@@ -13671,8 +13722,8 @@
         </w:pict>
       </w:r>
     </w:p>
-    <w:bookmarkEnd w:id="83"/>
-    <w:bookmarkStart w:id="84" w:name="logros-de-esta-unidad"/>
+    <w:bookmarkEnd w:id="92"/>
+    <w:bookmarkStart w:id="93" w:name="logros-de-esta-unidad"/>
     <w:p>
       <w:pPr>
         <w:pStyle w:val="Heading2"/>
@@ -13892,8 +13943,8 @@
         </w:pict>
       </w:r>
     </w:p>
-    <w:bookmarkEnd w:id="84"/>
-    <w:bookmarkStart w:id="85" w:name="atrévete-a-pensar"/>
+    <w:bookmarkEnd w:id="93"/>
+    <w:bookmarkStart w:id="94" w:name="atrévete-a-pensar"/>
     <w:p>
       <w:pPr>
         <w:pStyle w:val="Heading2"/>
@@ -14078,8 +14129,8 @@
         </w:pict>
       </w:r>
     </w:p>
-    <w:bookmarkEnd w:id="85"/>
-    <w:bookmarkStart w:id="86" w:name="crucigrama-de-bits"/>
+    <w:bookmarkEnd w:id="94"/>
+    <w:bookmarkStart w:id="95" w:name="crucigrama-de-bits"/>
     <w:p>
       <w:pPr>
         <w:pStyle w:val="Heading2"/>
@@ -14225,8 +14276,8 @@
         </w:pict>
       </w:r>
     </w:p>
-    <w:bookmarkEnd w:id="86"/>
-    <w:bookmarkStart w:id="87" w:name="preguntas-de-entrevista-de-trabajo"/>
+    <w:bookmarkEnd w:id="95"/>
+    <w:bookmarkStart w:id="96" w:name="preguntas-de-entrevista-de-trabajo"/>
     <w:p>
       <w:pPr>
         <w:pStyle w:val="Heading2"/>
@@ -14431,8 +14482,8 @@
         </w:pict>
       </w:r>
     </w:p>
-    <w:bookmarkEnd w:id="87"/>
-    <w:bookmarkStart w:id="88" w:name="no-hay-preguntas-tontas"/>
+    <w:bookmarkEnd w:id="96"/>
+    <w:bookmarkStart w:id="97" w:name="no-hay-preguntas-tontas"/>
     <w:p>
       <w:pPr>
         <w:pStyle w:val="Heading2"/>
@@ -14595,8 +14646,8 @@
         </w:pict>
       </w:r>
     </w:p>
-    <w:bookmarkEnd w:id="88"/>
-    <w:bookmarkStart w:id="89" w:name="poscréditos"/>
+    <w:bookmarkEnd w:id="97"/>
+    <w:bookmarkStart w:id="98" w:name="poscréditos"/>
     <w:p>
       <w:pPr>
         <w:pStyle w:val="Heading2"/>
@@ -14675,8 +14726,8 @@
         </w:pict>
       </w:r>
     </w:p>
-    <w:bookmarkEnd w:id="89"/>
-    <w:bookmarkStart w:id="90" w:name="criterios-de-evaluación-cubiertos-ra4-1"/>
+    <w:bookmarkEnd w:id="98"/>
+    <w:bookmarkStart w:id="99" w:name="criterios-de-evaluación-cubiertos-ra4-1"/>
     <w:p>
       <w:pPr>
         <w:pStyle w:val="Heading2"/>
@@ -14959,7 +15010,7 @@
       <w:r>
         <w:t xml:space="preserve"> </w:t>
       </w:r>
-      <w:hyperlink r:id="rId41">
+      <w:hyperlink r:id="rId44">
         <w:r>
           <w:rPr>
             <w:rStyle w:val="Hyperlink"/>
@@ -15022,8 +15073,8 @@
         </w:r>
       </w:hyperlink>
     </w:p>
-    <w:bookmarkEnd w:id="90"/>
-    <w:bookmarkEnd w:id="91"/>
+    <w:bookmarkEnd w:id="99"/>
+    <w:bookmarkEnd w:id="100"/>
     <w:sectPr/>
   </w:body>
 </w:document>

</xml_diff>